<commit_message>
Regenerate Manual 02 trilingual publication candidates
</commit_message>
<xml_diff>
--- a/02-management-systems/ISO_IEC_42001_AIMS/publication/qa-candidate/Manual_02_ISO_IEC_42001_AI_Management_System_EN.docx
+++ b/02-management-systems/ISO_IEC_42001_AIMS/publication/qa-candidate/Manual_02_ISO_IEC_42001_AI_Management_System_EN.docx
@@ -114,7 +114,7 @@
     <w:p>
       <w:pPr/>
       <w:r>
-        <w:t>Publication control — Version: First Edition / v1.0; Language: EN; Source: build/iso-iec-42001-manual-02-2026@b1ddffa6a33376ec72db570d8437f996cf61b97d; Generated: 2026-08-24; Review status: PUBLICATION QA CANDIDATE — CONTROLLED ENGLISH SOURCE. AI assistance is disclosed in the repository; human authorship and accountability remain with Alberto (Al) Leiva. Document generation alone does not establish certification, conformity, legal compliance, or audit assurance.</w:t>
+        <w:t>Publication control — Version: First Edition / v1.0; Language: EN; Source: build/iso-iec-42001-manual-02-2026@647c88fa905a16cba4e3ec162a32aad56f48c58b; Generated: 2026-08-24; Review status: PUBLICATION QA CANDIDATE — CONTROLLED ENGLISH SOURCE. AI assistance is disclosed in the repository; human authorship and accountability remain with Alberto (Al) Leiva. Document generation alone does not establish certification, conformity, legal compliance, or audit assurance.</w:t>
       </w:r>
     </w:p>
     <w:p>
@@ -10982,13 +10982,7 @@
         <w:spacing w:after="200"/>
       </w:pPr>
       <w:r>
-        <w:rPr>
-          <w:rFonts w:ascii="Aptos" w:hAnsi="Aptos"/>
-          <w:i/>
-          <w:color w:val="5B6570"/>
-          <w:sz w:val="22"/>
-        </w:rPr>
-        <w:t>Annex A.4 requires visibility into the data, tools, system/compute, and people needed across the AI life cycle.</w:t>
+        <w:t>When Annex A.4 controls are selected through the organization's risk-treatment process and Statement of Applicability, implementation should maintain visibility into the data, tools, systems and computing resources, and people needed across the AI life cycle.</w:t>
       </w:r>
     </w:p>
     <w:tbl>
@@ -11961,13 +11955,7 @@
         <w:spacing w:after="200"/>
       </w:pPr>
       <w:r>
-        <w:rPr>
-          <w:rFonts w:ascii="Aptos" w:hAnsi="Aptos"/>
-          <w:i/>
-          <w:color w:val="5B6570"/>
-          <w:sz w:val="22"/>
-        </w:rPr>
-        <w:t>Annex A.7 requires governed data acquisition, quality, provenance, and preparation for AI development, enhancement, and operation.</w:t>
+        <w:t>When Annex A.7 controls are selected through the organization's risk-treatment process and Statement of Applicability, implementation should govern data acquisition, quality, provenance, and preparation for AI development, enhancement, and operation.</w:t>
       </w:r>
     </w:p>
     <w:p>
@@ -11979,7 +11967,7 @@
         <w:drawing>
           <wp:inline xmlns:a="http://schemas.openxmlformats.org/drawingml/2006/main" xmlns:pic="http://schemas.openxmlformats.org/drawingml/2006/picture">
             <wp:extent cx="5623560" cy="2956017"/>
-            <wp:docPr id="7" name="Manual 02 Figure 7" descr="Lineage must connect source and authority to transformations, quality, use, retention, and deletion." title="Figure 7"/>
+            <wp:docPr id="7" name="Manual 02 Figure 7" descr="Recommended evidence flow connects source and authority to transformations, quality, use, retention, and deletion." title="Figure 7"/>
             <wp:cNvGraphicFramePr>
               <a:graphicFrameLocks noChangeAspect="1"/>
             </wp:cNvGraphicFramePr>
@@ -12389,13 +12377,7 @@
         <w:spacing w:after="200"/>
       </w:pPr>
       <w:r>
-        <w:rPr>
-          <w:rFonts w:ascii="Aptos" w:hAnsi="Aptos"/>
-          <w:i/>
-          <w:color w:val="5B6570"/>
-          <w:sz w:val="22"/>
-        </w:rPr>
-        <w:t>Annex A.8 requires useful information for users and interested parties, plus reporting and incident communication.</w:t>
+        <w:t>When Annex A.8 controls are selected through the organization's risk-treatment process and Statement of Applicability, implementation should provide useful information for users and interested parties, together with reporting and incident communication.</w:t>
       </w:r>
     </w:p>
     <w:p>
@@ -12584,7 +12566,7 @@
         <w:drawing>
           <wp:inline xmlns:a="http://schemas.openxmlformats.org/drawingml/2006/main" xmlns:pic="http://schemas.openxmlformats.org/drawingml/2006/picture">
             <wp:extent cx="5623560" cy="2956017"/>
-            <wp:docPr id="9" name="Manual 02 Figure 9" descr="Supplier assurance must match the exact model, service, use, data flow, and customer configuration." title="Figure 9"/>
+            <wp:docPr id="9" name="Manual 02 Figure 9" descr="Risk-based supplier assurance matches the exact model, service, use, data flow, and customer configuration." title="Figure 9"/>
             <wp:cNvGraphicFramePr>
               <a:graphicFrameLocks noChangeAspect="1"/>
             </wp:cNvGraphicFramePr>
@@ -21466,7 +21448,7 @@
       <w:jc w:val="center"/>
     </w:pPr>
     <w:r>
-      <w:t xml:space="preserve">build/iso-iec-42001-manual-02-2026@b1ddffa6a333 | 2026-08-24 | Page </w:t>
+      <w:t xml:space="preserve">build/iso-iec-42001-manual-02-2026@647c88fa905a | 2026-08-24 | Page </w:t>
     </w:r>
     <w:r>
       <w:fldChar w:fldCharType="begin"/>

</xml_diff>